<commit_message>
Fixed HOD Routes bugs and createQuestion bugs
</commit_message>
<xml_diff>
--- a/backend/templates/template3.docx
+++ b/backend/templates/template3.docx
@@ -6,11 +6,13 @@
       <w:pPr>
         <w:jc w:val="center"/>
         <w:rPr>
+          <w:rFonts w:ascii="Times New Roman" w:hAnsi="Times New Roman" w:cs="Times New Roman"/>
           <w:lang w:val="en-US"/>
         </w:rPr>
       </w:pPr>
       <w:r>
         <w:rPr>
+          <w:rFonts w:ascii="Times New Roman" w:hAnsi="Times New Roman" w:cs="Times New Roman"/>
           <w:lang w:val="en-US"/>
         </w:rPr>
         <w:t>{</w:t>
@@ -18,6 +20,7 @@
       <w:proofErr w:type="spellStart"/>
       <w:r>
         <w:rPr>
+          <w:rFonts w:ascii="Times New Roman" w:hAnsi="Times New Roman" w:cs="Times New Roman"/>
           <w:lang w:val="en-US"/>
         </w:rPr>
         <w:t>assessmentName</w:t>
@@ -25,6 +28,7 @@
       <w:proofErr w:type="spellEnd"/>
       <w:r>
         <w:rPr>
+          <w:rFonts w:ascii="Times New Roman" w:hAnsi="Times New Roman" w:cs="Times New Roman"/>
           <w:lang w:val="en-US"/>
         </w:rPr>
         <w:t>}</w:t>
@@ -34,11 +38,13 @@
       <w:pPr>
         <w:jc w:val="center"/>
         <w:rPr>
+          <w:rFonts w:ascii="Times New Roman" w:hAnsi="Times New Roman" w:cs="Times New Roman"/>
           <w:lang w:val="en-US"/>
         </w:rPr>
       </w:pPr>
       <w:r>
         <w:rPr>
+          <w:rFonts w:ascii="Times New Roman" w:hAnsi="Times New Roman" w:cs="Times New Roman"/>
           <w:lang w:val="en-US"/>
         </w:rPr>
         <w:t>{</w:t>
@@ -46,6 +52,7 @@
       <w:proofErr w:type="spellStart"/>
       <w:r>
         <w:rPr>
+          <w:rFonts w:ascii="Times New Roman" w:hAnsi="Times New Roman" w:cs="Times New Roman"/>
           <w:lang w:val="en-US"/>
         </w:rPr>
         <w:t>courseCode</w:t>
@@ -54,6 +61,7 @@
       <w:proofErr w:type="gramStart"/>
       <w:r>
         <w:rPr>
+          <w:rFonts w:ascii="Times New Roman" w:hAnsi="Times New Roman" w:cs="Times New Roman"/>
           <w:lang w:val="en-US"/>
         </w:rPr>
         <w:t>}:{</w:t>
@@ -62,6 +70,7 @@
       <w:proofErr w:type="gramEnd"/>
       <w:r>
         <w:rPr>
+          <w:rFonts w:ascii="Times New Roman" w:hAnsi="Times New Roman" w:cs="Times New Roman"/>
           <w:lang w:val="en-US"/>
         </w:rPr>
         <w:t>courseName</w:t>
@@ -69,6 +78,7 @@
       <w:proofErr w:type="spellEnd"/>
       <w:r>
         <w:rPr>
+          <w:rFonts w:ascii="Times New Roman" w:hAnsi="Times New Roman" w:cs="Times New Roman"/>
           <w:lang w:val="en-US"/>
         </w:rPr>
         <w:t>}</w:t>
@@ -76,108 +86,204 @@
     </w:p>
     <w:p>
       <w:pPr>
-        <w:jc w:val="center"/>
-        <w:rPr>
+        <w:rPr>
+          <w:rFonts w:ascii="Times New Roman" w:hAnsi="Times New Roman" w:cs="Times New Roman"/>
           <w:lang w:val="en-US"/>
         </w:rPr>
       </w:pPr>
+      <w:r>
+        <w:rPr>
+          <w:rFonts w:ascii="Times New Roman" w:hAnsi="Times New Roman" w:cs="Times New Roman"/>
+          <w:lang w:val="en-US"/>
+        </w:rPr>
+        <w:t>General Instructions</w:t>
+      </w:r>
     </w:p>
     <w:p>
       <w:pPr>
-        <w:rPr>
-          <w:rFonts w:ascii="Times New Roman" w:hAnsi="Times New Roman" w:cs="Times New Roman"/>
-          <w:lang w:val="en-US"/>
-        </w:rPr>
-      </w:pPr>
-      <w:r>
-        <w:rPr>
-          <w:rFonts w:ascii="Times New Roman" w:hAnsi="Times New Roman" w:cs="Times New Roman"/>
-          <w:lang w:val="en-US"/>
-        </w:rPr>
-        <w:t xml:space="preserve">{#questions} </w:t>
+        <w:pStyle w:val="ListParagraph"/>
+        <w:numPr>
+          <w:ilvl w:val="0"/>
+          <w:numId w:val="3"/>
+        </w:numPr>
+        <w:spacing w:after="0" w:line="240" w:lineRule="auto"/>
+        <w:jc w:val="both"/>
+        <w:rPr>
+          <w:rFonts w:ascii="Times New Roman" w:eastAsia="Times New Roman" w:hAnsi="Times New Roman" w:cs="Times New Roman"/>
+          <w:lang w:val="en-IN" w:eastAsia="en-IN"/>
+        </w:rPr>
+      </w:pPr>
+      <w:r>
+        <w:rPr>
+          <w:rFonts w:ascii="Times New Roman" w:eastAsia="Times New Roman" w:hAnsi="Times New Roman" w:cs="Times New Roman"/>
+          <w:lang w:val="en-IN" w:eastAsia="en-IN"/>
+        </w:rPr>
+        <w:t>Turn off and submit all mobile phones to the invigilator before the exam starts.</w:t>
       </w:r>
     </w:p>
     <w:p>
       <w:pPr>
-        <w:rPr>
-          <w:rFonts w:ascii="Times New Roman" w:hAnsi="Times New Roman" w:cs="Times New Roman"/>
-          <w:lang w:val="en-US"/>
-        </w:rPr>
-      </w:pPr>
-      <w:r>
-        <w:rPr>
-          <w:rStyle w:val="markedcontent"/>
-          <w:rFonts w:ascii="Times New Roman" w:hAnsi="Times New Roman" w:cs="Times New Roman"/>
-          <w:sz w:val="24"/>
-          <w:szCs w:val="24"/>
-        </w:rPr>
-        <w:t xml:space="preserve">{number} </w:t>
-      </w:r>
-      <w:r>
-        <w:rPr>
-          <w:rStyle w:val="markedcontent"/>
-          <w:rFonts w:ascii="Times New Roman" w:hAnsi="Times New Roman" w:cs="Times New Roman"/>
-          <w:sz w:val="24"/>
-          <w:szCs w:val="24"/>
-        </w:rPr>
-        <w:t>{text}</w:t>
-      </w:r>
-      <w:r>
-        <w:rPr>
-          <w:rFonts w:ascii="Times New Roman" w:hAnsi="Times New Roman" w:cs="Times New Roman"/>
-          <w:sz w:val="24"/>
-          <w:szCs w:val="24"/>
-        </w:rPr>
-        <w:t>{</w:t>
-      </w:r>
-      <w:r>
-        <w:rPr>
-          <w:rStyle w:val="hljs-selector-id"/>
-          <w:rFonts w:ascii="Times New Roman" w:hAnsi="Times New Roman" w:cs="Times New Roman"/>
-          <w:sz w:val="24"/>
-          <w:szCs w:val="24"/>
-        </w:rPr>
-        <w:t>#options</w:t>
-      </w:r>
-      <w:r>
-        <w:rPr>
-          <w:rFonts w:ascii="Times New Roman" w:hAnsi="Times New Roman" w:cs="Times New Roman"/>
-          <w:sz w:val="24"/>
-          <w:szCs w:val="24"/>
-        </w:rPr>
-        <w:t>}</w:t>
+        <w:pStyle w:val="ListParagraph"/>
+        <w:numPr>
+          <w:ilvl w:val="0"/>
+          <w:numId w:val="3"/>
+        </w:numPr>
+        <w:spacing w:after="0" w:line="240" w:lineRule="auto"/>
+        <w:jc w:val="both"/>
+        <w:rPr>
+          <w:rFonts w:ascii="Times New Roman" w:eastAsia="Times New Roman" w:hAnsi="Times New Roman" w:cs="Times New Roman"/>
+          <w:lang w:val="en-IN" w:eastAsia="en-IN"/>
+        </w:rPr>
+      </w:pPr>
+      <w:r>
+        <w:rPr>
+          <w:rFonts w:ascii="Times New Roman" w:eastAsia="Times New Roman" w:hAnsi="Times New Roman" w:cs="Times New Roman"/>
+          <w:lang w:val="en-IN" w:eastAsia="en-IN"/>
+        </w:rPr>
+        <w:t>Use blue or black ink for writing answers; pencils are allowed only for diagrams.</w:t>
       </w:r>
     </w:p>
     <w:p>
       <w:pPr>
-        <w:rPr>
-          <w:rFonts w:ascii="Times New Roman" w:hAnsi="Times New Roman" w:cs="Times New Roman"/>
-          <w:sz w:val="24"/>
-          <w:szCs w:val="24"/>
-        </w:rPr>
-      </w:pPr>
-      <w:r>
-        <w:rPr>
-          <w:rFonts w:ascii="Times New Roman" w:hAnsi="Times New Roman" w:cs="Times New Roman"/>
-          <w:sz w:val="24"/>
-          <w:szCs w:val="24"/>
-        </w:rPr>
-        <w:t xml:space="preserve"> -{option}{/options}</w:t>
+        <w:pStyle w:val="ListParagraph"/>
+        <w:numPr>
+          <w:ilvl w:val="0"/>
+          <w:numId w:val="3"/>
+        </w:numPr>
+        <w:spacing w:after="0" w:line="240" w:lineRule="auto"/>
+        <w:jc w:val="both"/>
+        <w:rPr>
+          <w:rFonts w:ascii="Times New Roman" w:eastAsia="Times New Roman" w:hAnsi="Times New Roman" w:cs="Times New Roman"/>
+          <w:lang w:val="en-IN" w:eastAsia="en-IN"/>
+        </w:rPr>
+      </w:pPr>
+      <w:r>
+        <w:rPr>
+          <w:rFonts w:ascii="Times New Roman" w:eastAsia="Times New Roman" w:hAnsi="Times New Roman" w:cs="Times New Roman"/>
+          <w:lang w:val="en-IN" w:eastAsia="en-IN"/>
+        </w:rPr>
+        <w:t>Maintain silence and do not communicate with other students during the exam.</w:t>
       </w:r>
     </w:p>
     <w:p>
       <w:pPr>
-        <w:rPr>
-          <w:rFonts w:ascii="Times New Roman" w:hAnsi="Times New Roman" w:cs="Times New Roman"/>
-          <w:sz w:val="24"/>
-          <w:szCs w:val="24"/>
-        </w:rPr>
-      </w:pPr>
-      <w:r>
-        <w:rPr>
-          <w:rFonts w:ascii="Times New Roman" w:hAnsi="Times New Roman" w:cs="Times New Roman"/>
-          <w:sz w:val="24"/>
-          <w:szCs w:val="24"/>
+        <w:pStyle w:val="ListParagraph"/>
+        <w:numPr>
+          <w:ilvl w:val="0"/>
+          <w:numId w:val="3"/>
+        </w:numPr>
+        <w:spacing w:after="0" w:line="240" w:lineRule="auto"/>
+        <w:jc w:val="both"/>
+        <w:rPr>
+          <w:rFonts w:ascii="Times New Roman" w:eastAsia="Times New Roman" w:hAnsi="Times New Roman" w:cs="Times New Roman"/>
+          <w:lang w:val="en-IN" w:eastAsia="en-IN"/>
+        </w:rPr>
+      </w:pPr>
+      <w:r>
+        <w:rPr>
+          <w:rFonts w:ascii="Times New Roman" w:eastAsia="Times New Roman" w:hAnsi="Times New Roman" w:cs="Times New Roman"/>
+          <w:lang w:val="en-IN" w:eastAsia="en-IN"/>
+        </w:rPr>
+        <w:t>Raise your hand to ask any questions; do not leave your seat without permission.</w:t>
+      </w:r>
+    </w:p>
+    <w:p>
+      <w:pPr>
+        <w:pStyle w:val="ListParagraph"/>
+        <w:numPr>
+          <w:ilvl w:val="0"/>
+          <w:numId w:val="3"/>
+        </w:numPr>
+        <w:jc w:val="both"/>
+        <w:rPr>
+          <w:rFonts w:ascii="Times New Roman" w:hAnsi="Times New Roman" w:cs="Times New Roman"/>
+          <w:lang w:val="en-US"/>
+        </w:rPr>
+      </w:pPr>
+      <w:r>
+        <w:rPr>
+          <w:rFonts w:ascii="Times New Roman" w:eastAsia="Times New Roman" w:hAnsi="Times New Roman" w:cs="Times New Roman"/>
+          <w:lang w:val="en-IN" w:eastAsia="en-IN"/>
+        </w:rPr>
+        <w:t>Submit your answer sheets promptly at the end of the exam; late submissions will not be accepted.</w:t>
+      </w:r>
+    </w:p>
+    <w:p>
+      <w:pPr>
+        <w:spacing w:after="0"/>
+        <w:rPr>
+          <w:rFonts w:ascii="Times New Roman" w:hAnsi="Times New Roman" w:cs="Times New Roman"/>
+          <w:lang w:val="en-US"/>
+        </w:rPr>
+      </w:pPr>
+      <w:r>
+        <w:rPr>
+          <w:rFonts w:ascii="Times New Roman" w:hAnsi="Times New Roman" w:cs="Times New Roman"/>
+          <w:lang w:val="en-US"/>
+        </w:rPr>
+        <w:t xml:space="preserve">{#questions} </w:t>
+      </w:r>
+    </w:p>
+    <w:p>
+      <w:pPr>
+        <w:spacing w:after="0" w:line="120" w:lineRule="auto"/>
+        <w:rPr>
+          <w:rFonts w:ascii="Times New Roman" w:hAnsi="Times New Roman" w:cs="Times New Roman"/>
+          <w:lang w:val="en-US"/>
+        </w:rPr>
+      </w:pPr>
+      <w:r>
+        <w:rPr>
+          <w:rStyle w:val="markedcontent"/>
+          <w:rFonts w:ascii="Times New Roman" w:hAnsi="Times New Roman" w:cs="Times New Roman"/>
+        </w:rPr>
+        <w:t>{number} {text}</w:t>
+      </w:r>
+      <w:r>
+        <w:rPr>
+          <w:rFonts w:ascii="Times New Roman" w:hAnsi="Times New Roman" w:cs="Times New Roman"/>
+        </w:rPr>
+        <w:t>{</w:t>
+      </w:r>
+      <w:r>
+        <w:rPr>
+          <w:rStyle w:val="hljs-selector-id"/>
+          <w:rFonts w:ascii="Times New Roman" w:hAnsi="Times New Roman" w:cs="Times New Roman"/>
+        </w:rPr>
+        <w:t>#options</w:t>
+      </w:r>
+      <w:r>
+        <w:rPr>
+          <w:rFonts w:ascii="Times New Roman" w:hAnsi="Times New Roman" w:cs="Times New Roman"/>
+        </w:rPr>
+        <w:t>}</w:t>
+      </w:r>
+    </w:p>
+    <w:p>
+      <w:pPr>
+        <w:spacing w:after="0" w:line="120" w:lineRule="auto"/>
+        <w:rPr>
+          <w:rFonts w:ascii="Times New Roman" w:hAnsi="Times New Roman" w:cs="Times New Roman"/>
+          <w:lang w:val="en-US"/>
+        </w:rPr>
+      </w:pPr>
+      <w:r>
+        <w:rPr>
+          <w:rFonts w:ascii="Times New Roman" w:hAnsi="Times New Roman" w:cs="Times New Roman"/>
+        </w:rPr>
+        <w:t>-{option}{/options}</w:t>
+      </w:r>
+    </w:p>
+    <w:p>
+      <w:pPr>
+        <w:spacing w:after="0"/>
+        <w:rPr>
+          <w:rFonts w:ascii="Times New Roman" w:hAnsi="Times New Roman" w:cs="Times New Roman"/>
+        </w:rPr>
+      </w:pPr>
+      <w:r>
+        <w:rPr>
+          <w:rFonts w:ascii="Times New Roman" w:hAnsi="Times New Roman" w:cs="Times New Roman"/>
         </w:rPr>
         <w:t>{/questions}</w:t>
       </w:r>
@@ -190,6 +296,358 @@
     </w:sectPr>
   </w:body>
 </w:document>
+</file>
+
+<file path=word/numbering.xml><?xml version="1.0" encoding="utf-8"?>
+<w:numbering xmlns:wpc="http://schemas.microsoft.com/office/word/2010/wordprocessingCanvas" xmlns:cx="http://schemas.microsoft.com/office/drawing/2014/chartex" xmlns:cx1="http://schemas.microsoft.com/office/drawing/2015/9/8/chartex" xmlns:cx2="http://schemas.microsoft.com/office/drawing/2015/10/21/chartex" xmlns:cx3="http://schemas.microsoft.com/office/drawing/2016/5/9/chartex" xmlns:cx4="http://schemas.microsoft.com/office/drawing/2016/5/10/chartex" xmlns:cx5="http://schemas.microsoft.com/office/drawing/2016/5/11/chartex" xmlns:cx6="http://schemas.microsoft.com/office/drawing/2016/5/12/chartex" xmlns:cx7="http://schemas.microsoft.com/office/drawing/2016/5/13/chartex" xmlns:cx8="http://schemas.microsoft.com/office/drawing/2016/5/14/chartex" xmlns:mc="http://schemas.openxmlformats.org/markup-compatibility/2006" xmlns:aink="http://schemas.microsoft.com/office/drawing/2016/ink" xmlns:am3d="http://schemas.microsoft.com/office/drawing/2017/model3d" xmlns:o="urn:schemas-microsoft-com:office:office" xmlns:oel="http://schemas.microsoft.com/office/2019/extlst" xmlns:r="http://schemas.openxmlformats.org/officeDocument/2006/relationships" xmlns:m="http://schemas.openxmlformats.org/officeDocument/2006/math" xmlns:v="urn:schemas-microsoft-com:vml" xmlns:wp14="http://schemas.microsoft.com/office/word/2010/wordprocessingDrawing" xmlns:wp="http://schemas.openxmlformats.org/drawingml/2006/wordprocessingDrawing" xmlns:w10="urn:schemas-microsoft-com:office:word" xmlns:w="http://schemas.openxmlformats.org/wordprocessingml/2006/main" xmlns:w14="http://schemas.microsoft.com/office/word/2010/wordml" xmlns:w15="http://schemas.microsoft.com/office/word/2012/wordml" xmlns:w16cex="http://schemas.microsoft.com/office/word/2018/wordml/cex" xmlns:w16cid="http://schemas.microsoft.com/office/word/2016/wordml/cid" xmlns:w16="http://schemas.microsoft.com/office/word/2018/wordml" xmlns:w16du="http://schemas.microsoft.com/office/word/2023/wordml/word16du" xmlns:w16sdtdh="http://schemas.microsoft.com/office/word/2020/wordml/sdtdatahash" xmlns:w16se="http://schemas.microsoft.com/office/word/2015/wordml/symex" xmlns:wpg="http://schemas.microsoft.com/office/word/2010/wordprocessingGroup" xmlns:wpi="http://schemas.microsoft.com/office/word/2010/wordprocessingInk" xmlns:wne="http://schemas.microsoft.com/office/word/2006/wordml" xmlns:wps="http://schemas.microsoft.com/office/word/2010/wordprocessingShape" mc:Ignorable="w14 w15 w16se w16cid w16 w16cex w16sdtdh w16du wp14">
+  <w:abstractNum w:abstractNumId="0" w15:restartNumberingAfterBreak="0">
+    <w:nsid w:val="32ED71BA"/>
+    <w:multiLevelType w:val="hybridMultilevel"/>
+    <w:tmpl w:val="E7FC59C4"/>
+    <w:lvl w:ilvl="0" w:tplc="4009000F">
+      <w:start w:val="1"/>
+      <w:numFmt w:val="decimal"/>
+      <w:lvlText w:val="%1."/>
+      <w:lvlJc w:val="left"/>
+      <w:pPr>
+        <w:ind w:left="720" w:hanging="360"/>
+      </w:pPr>
+      <w:rPr>
+        <w:rFonts w:hint="default"/>
+      </w:rPr>
+    </w:lvl>
+    <w:lvl w:ilvl="1" w:tplc="FFFFFFFF" w:tentative="1">
+      <w:start w:val="1"/>
+      <w:numFmt w:val="bullet"/>
+      <w:lvlText w:val="o"/>
+      <w:lvlJc w:val="left"/>
+      <w:pPr>
+        <w:ind w:left="1440" w:hanging="360"/>
+      </w:pPr>
+      <w:rPr>
+        <w:rFonts w:ascii="Courier New" w:hAnsi="Courier New" w:cs="Courier New" w:hint="default"/>
+      </w:rPr>
+    </w:lvl>
+    <w:lvl w:ilvl="2" w:tplc="FFFFFFFF" w:tentative="1">
+      <w:start w:val="1"/>
+      <w:numFmt w:val="bullet"/>
+      <w:lvlText w:val=""/>
+      <w:lvlJc w:val="left"/>
+      <w:pPr>
+        <w:ind w:left="2160" w:hanging="360"/>
+      </w:pPr>
+      <w:rPr>
+        <w:rFonts w:ascii="Wingdings" w:hAnsi="Wingdings" w:hint="default"/>
+      </w:rPr>
+    </w:lvl>
+    <w:lvl w:ilvl="3" w:tplc="FFFFFFFF" w:tentative="1">
+      <w:start w:val="1"/>
+      <w:numFmt w:val="bullet"/>
+      <w:lvlText w:val=""/>
+      <w:lvlJc w:val="left"/>
+      <w:pPr>
+        <w:ind w:left="2880" w:hanging="360"/>
+      </w:pPr>
+      <w:rPr>
+        <w:rFonts w:ascii="Symbol" w:hAnsi="Symbol" w:hint="default"/>
+      </w:rPr>
+    </w:lvl>
+    <w:lvl w:ilvl="4" w:tplc="FFFFFFFF" w:tentative="1">
+      <w:start w:val="1"/>
+      <w:numFmt w:val="bullet"/>
+      <w:lvlText w:val="o"/>
+      <w:lvlJc w:val="left"/>
+      <w:pPr>
+        <w:ind w:left="3600" w:hanging="360"/>
+      </w:pPr>
+      <w:rPr>
+        <w:rFonts w:ascii="Courier New" w:hAnsi="Courier New" w:cs="Courier New" w:hint="default"/>
+      </w:rPr>
+    </w:lvl>
+    <w:lvl w:ilvl="5" w:tplc="FFFFFFFF" w:tentative="1">
+      <w:start w:val="1"/>
+      <w:numFmt w:val="bullet"/>
+      <w:lvlText w:val=""/>
+      <w:lvlJc w:val="left"/>
+      <w:pPr>
+        <w:ind w:left="4320" w:hanging="360"/>
+      </w:pPr>
+      <w:rPr>
+        <w:rFonts w:ascii="Wingdings" w:hAnsi="Wingdings" w:hint="default"/>
+      </w:rPr>
+    </w:lvl>
+    <w:lvl w:ilvl="6" w:tplc="FFFFFFFF" w:tentative="1">
+      <w:start w:val="1"/>
+      <w:numFmt w:val="bullet"/>
+      <w:lvlText w:val=""/>
+      <w:lvlJc w:val="left"/>
+      <w:pPr>
+        <w:ind w:left="5040" w:hanging="360"/>
+      </w:pPr>
+      <w:rPr>
+        <w:rFonts w:ascii="Symbol" w:hAnsi="Symbol" w:hint="default"/>
+      </w:rPr>
+    </w:lvl>
+    <w:lvl w:ilvl="7" w:tplc="FFFFFFFF" w:tentative="1">
+      <w:start w:val="1"/>
+      <w:numFmt w:val="bullet"/>
+      <w:lvlText w:val="o"/>
+      <w:lvlJc w:val="left"/>
+      <w:pPr>
+        <w:ind w:left="5760" w:hanging="360"/>
+      </w:pPr>
+      <w:rPr>
+        <w:rFonts w:ascii="Courier New" w:hAnsi="Courier New" w:cs="Courier New" w:hint="default"/>
+      </w:rPr>
+    </w:lvl>
+    <w:lvl w:ilvl="8" w:tplc="FFFFFFFF" w:tentative="1">
+      <w:start w:val="1"/>
+      <w:numFmt w:val="bullet"/>
+      <w:lvlText w:val=""/>
+      <w:lvlJc w:val="left"/>
+      <w:pPr>
+        <w:ind w:left="6480" w:hanging="360"/>
+      </w:pPr>
+      <w:rPr>
+        <w:rFonts w:ascii="Wingdings" w:hAnsi="Wingdings" w:hint="default"/>
+      </w:rPr>
+    </w:lvl>
+  </w:abstractNum>
+  <w:abstractNum w:abstractNumId="1" w15:restartNumberingAfterBreak="0">
+    <w:nsid w:val="3C8B5314"/>
+    <w:multiLevelType w:val="hybridMultilevel"/>
+    <w:tmpl w:val="41326810"/>
+    <w:lvl w:ilvl="0" w:tplc="40090001">
+      <w:numFmt w:val="bullet"/>
+      <w:lvlText w:val=""/>
+      <w:lvlJc w:val="left"/>
+      <w:pPr>
+        <w:ind w:left="720" w:hanging="360"/>
+      </w:pPr>
+      <w:rPr>
+        <w:rFonts w:ascii="Symbol" w:eastAsia="Times New Roman" w:hAnsi="Symbol" w:cs="Times New Roman" w:hint="default"/>
+      </w:rPr>
+    </w:lvl>
+    <w:lvl w:ilvl="1" w:tplc="40090003" w:tentative="1">
+      <w:start w:val="1"/>
+      <w:numFmt w:val="bullet"/>
+      <w:lvlText w:val="o"/>
+      <w:lvlJc w:val="left"/>
+      <w:pPr>
+        <w:ind w:left="1440" w:hanging="360"/>
+      </w:pPr>
+      <w:rPr>
+        <w:rFonts w:ascii="Courier New" w:hAnsi="Courier New" w:cs="Courier New" w:hint="default"/>
+      </w:rPr>
+    </w:lvl>
+    <w:lvl w:ilvl="2" w:tplc="40090005" w:tentative="1">
+      <w:start w:val="1"/>
+      <w:numFmt w:val="bullet"/>
+      <w:lvlText w:val=""/>
+      <w:lvlJc w:val="left"/>
+      <w:pPr>
+        <w:ind w:left="2160" w:hanging="360"/>
+      </w:pPr>
+      <w:rPr>
+        <w:rFonts w:ascii="Wingdings" w:hAnsi="Wingdings" w:hint="default"/>
+      </w:rPr>
+    </w:lvl>
+    <w:lvl w:ilvl="3" w:tplc="40090001" w:tentative="1">
+      <w:start w:val="1"/>
+      <w:numFmt w:val="bullet"/>
+      <w:lvlText w:val=""/>
+      <w:lvlJc w:val="left"/>
+      <w:pPr>
+        <w:ind w:left="2880" w:hanging="360"/>
+      </w:pPr>
+      <w:rPr>
+        <w:rFonts w:ascii="Symbol" w:hAnsi="Symbol" w:hint="default"/>
+      </w:rPr>
+    </w:lvl>
+    <w:lvl w:ilvl="4" w:tplc="40090003" w:tentative="1">
+      <w:start w:val="1"/>
+      <w:numFmt w:val="bullet"/>
+      <w:lvlText w:val="o"/>
+      <w:lvlJc w:val="left"/>
+      <w:pPr>
+        <w:ind w:left="3600" w:hanging="360"/>
+      </w:pPr>
+      <w:rPr>
+        <w:rFonts w:ascii="Courier New" w:hAnsi="Courier New" w:cs="Courier New" w:hint="default"/>
+      </w:rPr>
+    </w:lvl>
+    <w:lvl w:ilvl="5" w:tplc="40090005" w:tentative="1">
+      <w:start w:val="1"/>
+      <w:numFmt w:val="bullet"/>
+      <w:lvlText w:val=""/>
+      <w:lvlJc w:val="left"/>
+      <w:pPr>
+        <w:ind w:left="4320" w:hanging="360"/>
+      </w:pPr>
+      <w:rPr>
+        <w:rFonts w:ascii="Wingdings" w:hAnsi="Wingdings" w:hint="default"/>
+      </w:rPr>
+    </w:lvl>
+    <w:lvl w:ilvl="6" w:tplc="40090001" w:tentative="1">
+      <w:start w:val="1"/>
+      <w:numFmt w:val="bullet"/>
+      <w:lvlText w:val=""/>
+      <w:lvlJc w:val="left"/>
+      <w:pPr>
+        <w:ind w:left="5040" w:hanging="360"/>
+      </w:pPr>
+      <w:rPr>
+        <w:rFonts w:ascii="Symbol" w:hAnsi="Symbol" w:hint="default"/>
+      </w:rPr>
+    </w:lvl>
+    <w:lvl w:ilvl="7" w:tplc="40090003" w:tentative="1">
+      <w:start w:val="1"/>
+      <w:numFmt w:val="bullet"/>
+      <w:lvlText w:val="o"/>
+      <w:lvlJc w:val="left"/>
+      <w:pPr>
+        <w:ind w:left="5760" w:hanging="360"/>
+      </w:pPr>
+      <w:rPr>
+        <w:rFonts w:ascii="Courier New" w:hAnsi="Courier New" w:cs="Courier New" w:hint="default"/>
+      </w:rPr>
+    </w:lvl>
+    <w:lvl w:ilvl="8" w:tplc="40090005" w:tentative="1">
+      <w:start w:val="1"/>
+      <w:numFmt w:val="bullet"/>
+      <w:lvlText w:val=""/>
+      <w:lvlJc w:val="left"/>
+      <w:pPr>
+        <w:ind w:left="6480" w:hanging="360"/>
+      </w:pPr>
+      <w:rPr>
+        <w:rFonts w:ascii="Wingdings" w:hAnsi="Wingdings" w:hint="default"/>
+      </w:rPr>
+    </w:lvl>
+  </w:abstractNum>
+  <w:abstractNum w:abstractNumId="2" w15:restartNumberingAfterBreak="0">
+    <w:nsid w:val="76020502"/>
+    <w:multiLevelType w:val="hybridMultilevel"/>
+    <w:tmpl w:val="BC5E014C"/>
+    <w:lvl w:ilvl="0" w:tplc="40090001">
+      <w:start w:val="1"/>
+      <w:numFmt w:val="bullet"/>
+      <w:lvlText w:val=""/>
+      <w:lvlJc w:val="left"/>
+      <w:pPr>
+        <w:ind w:left="720" w:hanging="360"/>
+      </w:pPr>
+      <w:rPr>
+        <w:rFonts w:ascii="Symbol" w:hAnsi="Symbol" w:hint="default"/>
+      </w:rPr>
+    </w:lvl>
+    <w:lvl w:ilvl="1" w:tplc="40090003" w:tentative="1">
+      <w:start w:val="1"/>
+      <w:numFmt w:val="bullet"/>
+      <w:lvlText w:val="o"/>
+      <w:lvlJc w:val="left"/>
+      <w:pPr>
+        <w:ind w:left="1440" w:hanging="360"/>
+      </w:pPr>
+      <w:rPr>
+        <w:rFonts w:ascii="Courier New" w:hAnsi="Courier New" w:cs="Courier New" w:hint="default"/>
+      </w:rPr>
+    </w:lvl>
+    <w:lvl w:ilvl="2" w:tplc="40090005" w:tentative="1">
+      <w:start w:val="1"/>
+      <w:numFmt w:val="bullet"/>
+      <w:lvlText w:val=""/>
+      <w:lvlJc w:val="left"/>
+      <w:pPr>
+        <w:ind w:left="2160" w:hanging="360"/>
+      </w:pPr>
+      <w:rPr>
+        <w:rFonts w:ascii="Wingdings" w:hAnsi="Wingdings" w:hint="default"/>
+      </w:rPr>
+    </w:lvl>
+    <w:lvl w:ilvl="3" w:tplc="40090001" w:tentative="1">
+      <w:start w:val="1"/>
+      <w:numFmt w:val="bullet"/>
+      <w:lvlText w:val=""/>
+      <w:lvlJc w:val="left"/>
+      <w:pPr>
+        <w:ind w:left="2880" w:hanging="360"/>
+      </w:pPr>
+      <w:rPr>
+        <w:rFonts w:ascii="Symbol" w:hAnsi="Symbol" w:hint="default"/>
+      </w:rPr>
+    </w:lvl>
+    <w:lvl w:ilvl="4" w:tplc="40090003" w:tentative="1">
+      <w:start w:val="1"/>
+      <w:numFmt w:val="bullet"/>
+      <w:lvlText w:val="o"/>
+      <w:lvlJc w:val="left"/>
+      <w:pPr>
+        <w:ind w:left="3600" w:hanging="360"/>
+      </w:pPr>
+      <w:rPr>
+        <w:rFonts w:ascii="Courier New" w:hAnsi="Courier New" w:cs="Courier New" w:hint="default"/>
+      </w:rPr>
+    </w:lvl>
+    <w:lvl w:ilvl="5" w:tplc="40090005" w:tentative="1">
+      <w:start w:val="1"/>
+      <w:numFmt w:val="bullet"/>
+      <w:lvlText w:val=""/>
+      <w:lvlJc w:val="left"/>
+      <w:pPr>
+        <w:ind w:left="4320" w:hanging="360"/>
+      </w:pPr>
+      <w:rPr>
+        <w:rFonts w:ascii="Wingdings" w:hAnsi="Wingdings" w:hint="default"/>
+      </w:rPr>
+    </w:lvl>
+    <w:lvl w:ilvl="6" w:tplc="40090001" w:tentative="1">
+      <w:start w:val="1"/>
+      <w:numFmt w:val="bullet"/>
+      <w:lvlText w:val=""/>
+      <w:lvlJc w:val="left"/>
+      <w:pPr>
+        <w:ind w:left="5040" w:hanging="360"/>
+      </w:pPr>
+      <w:rPr>
+        <w:rFonts w:ascii="Symbol" w:hAnsi="Symbol" w:hint="default"/>
+      </w:rPr>
+    </w:lvl>
+    <w:lvl w:ilvl="7" w:tplc="40090003" w:tentative="1">
+      <w:start w:val="1"/>
+      <w:numFmt w:val="bullet"/>
+      <w:lvlText w:val="o"/>
+      <w:lvlJc w:val="left"/>
+      <w:pPr>
+        <w:ind w:left="5760" w:hanging="360"/>
+      </w:pPr>
+      <w:rPr>
+        <w:rFonts w:ascii="Courier New" w:hAnsi="Courier New" w:cs="Courier New" w:hint="default"/>
+      </w:rPr>
+    </w:lvl>
+    <w:lvl w:ilvl="8" w:tplc="40090005" w:tentative="1">
+      <w:start w:val="1"/>
+      <w:numFmt w:val="bullet"/>
+      <w:lvlText w:val=""/>
+      <w:lvlJc w:val="left"/>
+      <w:pPr>
+        <w:ind w:left="6480" w:hanging="360"/>
+      </w:pPr>
+      <w:rPr>
+        <w:rFonts w:ascii="Wingdings" w:hAnsi="Wingdings" w:hint="default"/>
+      </w:rPr>
+    </w:lvl>
+  </w:abstractNum>
+  <w:num w:numId="1" w16cid:durableId="446388376">
+    <w:abstractNumId w:val="2"/>
+  </w:num>
+  <w:num w:numId="2" w16cid:durableId="488984595">
+    <w:abstractNumId w:val="1"/>
+  </w:num>
+  <w:num w:numId="3" w16cid:durableId="983697697">
+    <w:abstractNumId w:val="0"/>
+  </w:num>
+</w:numbering>
 </file>
 
 <file path=word/styles.xml><?xml version="1.0" encoding="utf-8"?>
@@ -1218,6 +1676,17 @@
     <w:basedOn w:val="DefaultParagraphFont"/>
     <w:rsid w:val="00A34079"/>
   </w:style>
+  <w:style w:type="character" w:styleId="Strong">
+    <w:name w:val="Strong"/>
+    <w:basedOn w:val="DefaultParagraphFont"/>
+    <w:uiPriority w:val="22"/>
+    <w:qFormat/>
+    <w:rsid w:val="0023788B"/>
+    <w:rPr>
+      <w:b/>
+      <w:bCs/>
+    </w:rPr>
+  </w:style>
 </w:styles>
 </file>
 

</xml_diff>

<commit_message>
Question Sanitization before downloading
</commit_message>
<xml_diff>
--- a/backend/templates/template3.docx
+++ b/backend/templates/template3.docx
@@ -1137,141 +1137,153 @@
     <w:p>
       <w:pPr>
         <w:spacing w:after="0" w:line="240" w:lineRule="auto"/>
-        <w:rPr>
-          <w:rFonts w:ascii="Times New Roman" w:hAnsi="Times New Roman" w:cs="Times New Roman"/>
+        <w:jc w:val="both"/>
+        <w:rPr>
+          <w:rFonts w:ascii="Times New Roman" w:hAnsi="Times New Roman" w:cs="Times New Roman"/>
+          <w:sz w:val="2"/>
+          <w:szCs w:val="2"/>
           <w:lang w:val="en-US"/>
         </w:rPr>
       </w:pPr>
+      <w:r>
+        <w:rPr>
+          <w:rFonts w:ascii="Times New Roman" w:hAnsi="Times New Roman" w:cs="Times New Roman"/>
+          <w:sz w:val="2"/>
+          <w:szCs w:val="2"/>
+          <w:lang w:val="en-US"/>
+        </w:rPr>
+        <w:t>{#questions}</w:t>
+      </w:r>
     </w:p>
     <w:p>
       <w:pPr>
-        <w:spacing w:after="0" w:line="240" w:lineRule="auto"/>
-        <w:jc w:val="both"/>
-        <w:rPr>
-          <w:rFonts w:ascii="Times New Roman" w:hAnsi="Times New Roman" w:cs="Times New Roman"/>
-          <w:lang w:val="en-US"/>
-        </w:rPr>
-      </w:pPr>
-      <w:r>
-        <w:rPr>
-          <w:rFonts w:ascii="Times New Roman" w:hAnsi="Times New Roman" w:cs="Times New Roman"/>
-          <w:lang w:val="en-US"/>
-        </w:rPr>
-        <w:t xml:space="preserve">{#questions} </w:t>
+        <w:spacing w:before="70" w:after="0" w:line="240" w:lineRule="auto"/>
+        <w:ind w:right="357"/>
+        <w:rPr>
+          <w:rStyle w:val="markedcontent"/>
+          <w:rFonts w:ascii="Times New Roman" w:hAnsi="Times New Roman" w:cs="Times New Roman"/>
+        </w:rPr>
+      </w:pPr>
+      <w:r>
+        <w:rPr>
+          <w:rStyle w:val="markedcontent"/>
+          <w:rFonts w:ascii="Times New Roman" w:hAnsi="Times New Roman" w:cs="Times New Roman"/>
+          <w:b/>
+          <w:bCs/>
+        </w:rPr>
+        <w:t>{number}</w:t>
+      </w:r>
+      <w:r>
+        <w:rPr>
+          <w:rStyle w:val="markedcontent"/>
+          <w:rFonts w:ascii="Times New Roman" w:hAnsi="Times New Roman" w:cs="Times New Roman"/>
+          <w:b/>
+          <w:bCs/>
+        </w:rPr>
+        <w:t>.</w:t>
+      </w:r>
+      <w:r>
+        <w:rPr>
+          <w:rStyle w:val="markedcontent"/>
+          <w:rFonts w:ascii="Times New Roman" w:hAnsi="Times New Roman" w:cs="Times New Roman"/>
+        </w:rPr>
+        <w:t xml:space="preserve"> {text}</w:t>
       </w:r>
     </w:p>
     <w:p>
       <w:pPr>
         <w:spacing w:after="0" w:line="240" w:lineRule="auto"/>
-        <w:jc w:val="both"/>
+        <w:ind w:right="360"/>
+        <w:rPr>
+          <w:rFonts w:ascii="Times New Roman" w:hAnsi="Times New Roman" w:cs="Times New Roman"/>
+          <w:sz w:val="20"/>
+          <w:szCs w:val="20"/>
+        </w:rPr>
+      </w:pPr>
+      <w:r>
         <w:rPr>
           <w:rStyle w:val="markedcontent"/>
           <w:rFonts w:ascii="Times New Roman" w:hAnsi="Times New Roman" w:cs="Times New Roman"/>
-        </w:rPr>
-      </w:pPr>
+          <w:sz w:val="20"/>
+          <w:szCs w:val="20"/>
+        </w:rPr>
+        <w:t>{%</w:t>
+      </w:r>
+      <w:proofErr w:type="gramStart"/>
       <w:r>
         <w:rPr>
           <w:rStyle w:val="markedcontent"/>
           <w:rFonts w:ascii="Times New Roman" w:hAnsi="Times New Roman" w:cs="Times New Roman"/>
-          <w:b/>
-          <w:bCs/>
-        </w:rPr>
-        <w:t>{number}</w:t>
-      </w:r>
-      <w:r>
-        <w:rPr>
-          <w:rStyle w:val="markedcontent"/>
-          <w:rFonts w:ascii="Times New Roman" w:hAnsi="Times New Roman" w:cs="Times New Roman"/>
-          <w:b/>
-          <w:bCs/>
-        </w:rPr>
-        <w:t>.</w:t>
-      </w:r>
-      <w:r>
-        <w:rPr>
-          <w:rStyle w:val="markedcontent"/>
-          <w:rFonts w:ascii="Times New Roman" w:hAnsi="Times New Roman" w:cs="Times New Roman"/>
-        </w:rPr>
-        <w:t xml:space="preserve"> {text}</w:t>
+          <w:sz w:val="20"/>
+          <w:szCs w:val="20"/>
+        </w:rPr>
+        <w:t>image}</w:t>
+      </w:r>
+      <w:r>
+        <w:rPr>
+          <w:rFonts w:ascii="Times New Roman" w:hAnsi="Times New Roman" w:cs="Times New Roman"/>
+          <w:sz w:val="20"/>
+          <w:szCs w:val="20"/>
+        </w:rPr>
+        <w:t>{</w:t>
+      </w:r>
+      <w:proofErr w:type="gramEnd"/>
+      <w:r>
+        <w:rPr>
+          <w:rStyle w:val="hljs-selector-id"/>
+          <w:rFonts w:ascii="Times New Roman" w:hAnsi="Times New Roman" w:cs="Times New Roman"/>
+          <w:sz w:val="20"/>
+          <w:szCs w:val="20"/>
+        </w:rPr>
+        <w:t>#options</w:t>
+      </w:r>
+      <w:r>
+        <w:rPr>
+          <w:rFonts w:ascii="Times New Roman" w:hAnsi="Times New Roman" w:cs="Times New Roman"/>
+          <w:sz w:val="20"/>
+          <w:szCs w:val="20"/>
+        </w:rPr>
+        <w:t>}</w:t>
       </w:r>
     </w:p>
     <w:p>
       <w:pPr>
         <w:spacing w:after="0" w:line="240" w:lineRule="auto"/>
-        <w:jc w:val="both"/>
-        <w:rPr>
-          <w:rFonts w:ascii="Times New Roman" w:hAnsi="Times New Roman" w:cs="Times New Roman"/>
-        </w:rPr>
-      </w:pPr>
-      <w:r>
-        <w:rPr>
-          <w:rStyle w:val="markedcontent"/>
-          <w:rFonts w:ascii="Times New Roman" w:hAnsi="Times New Roman" w:cs="Times New Roman"/>
-        </w:rPr>
-        <w:t>{%</w:t>
-      </w:r>
-      <w:proofErr w:type="gramStart"/>
-      <w:r>
-        <w:rPr>
-          <w:rStyle w:val="markedcontent"/>
-          <w:rFonts w:ascii="Times New Roman" w:hAnsi="Times New Roman" w:cs="Times New Roman"/>
-        </w:rPr>
-        <w:t>image}</w:t>
-      </w:r>
-      <w:r>
-        <w:rPr>
-          <w:rFonts w:ascii="Times New Roman" w:hAnsi="Times New Roman" w:cs="Times New Roman"/>
-        </w:rPr>
-        <w:t>{</w:t>
-      </w:r>
-      <w:proofErr w:type="gramEnd"/>
-      <w:r>
-        <w:rPr>
-          <w:rStyle w:val="hljs-selector-id"/>
-          <w:rFonts w:ascii="Times New Roman" w:hAnsi="Times New Roman" w:cs="Times New Roman"/>
-        </w:rPr>
-        <w:t>#options</w:t>
-      </w:r>
-      <w:r>
-        <w:rPr>
-          <w:rFonts w:ascii="Times New Roman" w:hAnsi="Times New Roman" w:cs="Times New Roman"/>
-        </w:rPr>
-        <w:t>}</w:t>
+        <w:ind w:left="340" w:right="357"/>
+        <w:rPr>
+          <w:rFonts w:ascii="Times New Roman" w:hAnsi="Times New Roman" w:cs="Times New Roman"/>
+        </w:rPr>
+      </w:pPr>
+      <w:r>
+        <w:rPr>
+          <w:rFonts w:ascii="Times New Roman" w:hAnsi="Times New Roman" w:cs="Times New Roman"/>
+        </w:rPr>
+        <w:t>{option}</w:t>
+      </w:r>
+      <w:r>
+        <w:rPr>
+          <w:rFonts w:ascii="Times New Roman" w:hAnsi="Times New Roman" w:cs="Times New Roman"/>
+          <w:sz w:val="20"/>
+          <w:szCs w:val="20"/>
+        </w:rPr>
+        <w:t>{/options}</w:t>
       </w:r>
     </w:p>
     <w:p>
       <w:pPr>
         <w:spacing w:after="0" w:line="240" w:lineRule="auto"/>
-        <w:jc w:val="both"/>
-        <w:rPr>
-          <w:rFonts w:ascii="Times New Roman" w:hAnsi="Times New Roman" w:cs="Times New Roman"/>
-          <w:lang w:val="en-US"/>
-        </w:rPr>
-      </w:pPr>
-      <w:r>
-        <w:rPr>
-          <w:rFonts w:ascii="Times New Roman" w:hAnsi="Times New Roman" w:cs="Times New Roman"/>
-        </w:rPr>
-        <w:t xml:space="preserve">    </w:t>
-      </w:r>
-      <w:r>
-        <w:rPr>
-          <w:rFonts w:ascii="Times New Roman" w:hAnsi="Times New Roman" w:cs="Times New Roman"/>
-        </w:rPr>
-        <w:t>{option}{/options}</w:t>
-      </w:r>
-    </w:p>
-    <w:p>
-      <w:pPr>
-        <w:spacing w:after="0" w:line="240" w:lineRule="auto"/>
-        <w:jc w:val="both"/>
-        <w:rPr>
-          <w:rFonts w:ascii="Times New Roman" w:hAnsi="Times New Roman" w:cs="Times New Roman"/>
-        </w:rPr>
-      </w:pPr>
-      <w:r>
-        <w:rPr>
-          <w:rFonts w:ascii="Times New Roman" w:hAnsi="Times New Roman" w:cs="Times New Roman"/>
+        <w:ind w:right="360"/>
+        <w:rPr>
+          <w:rFonts w:ascii="Times New Roman" w:hAnsi="Times New Roman" w:cs="Times New Roman"/>
+          <w:sz w:val="2"/>
+          <w:szCs w:val="2"/>
+        </w:rPr>
+      </w:pPr>
+      <w:r>
+        <w:rPr>
+          <w:rFonts w:ascii="Times New Roman" w:hAnsi="Times New Roman" w:cs="Times New Roman"/>
+          <w:sz w:val="2"/>
+          <w:szCs w:val="2"/>
         </w:rPr>
         <w:t>{/questions}</w:t>
       </w:r>
@@ -1280,7 +1292,7 @@
       <w:type w:val="continuous"/>
       <w:pgSz w:w="11906" w:h="16838"/>
       <w:pgMar w:top="1440" w:right="1080" w:bottom="1440" w:left="1080" w:header="708" w:footer="708" w:gutter="0"/>
-      <w:cols w:num="2" w:space="708"/>
+      <w:cols w:num="2" w:space="26"/>
       <w:docGrid w:linePitch="360"/>
     </w:sectPr>
   </w:body>

</xml_diff>